<commit_message>
Music Mate 2.0 Production Release
</commit_message>
<xml_diff>
--- a/Docs/Design.docx
+++ b/Docs/Design.docx
@@ -16,6 +16,26 @@
         </w:numPr>
       </w:pPr>
       <w:r>
+        <w:t>Factory Defaults</w:t>
+      </w:r>
+      <w:r>
+        <w:br/>
+        <w:t>Are scattered all over the place but you can see where they live in SettingsResetService.AppSettingsSnapshot</w:t>
+      </w:r>
+      <w:r>
+        <w:br/>
+        <w:t>Many are in class SettingsPageViewModel</w:t>
+      </w:r>
+    </w:p>
+    <w:p>
+      <w:pPr>
+        <w:pStyle w:val="ListParagraph"/>
+        <w:numPr>
+          <w:ilvl w:val="0"/>
+          <w:numId w:val="1"/>
+        </w:numPr>
+      </w:pPr>
+      <w:r>
         <w:rPr>
           <w:b/>
           <w:bCs/>
@@ -546,6 +566,7 @@
         </w:numPr>
       </w:pPr>
       <w:r>
+        <w:lastRenderedPageBreak/>
         <w:t xml:space="preserve">If </w:t>
       </w:r>
       <w:r>
@@ -576,7 +597,6 @@
         </w:numPr>
       </w:pPr>
       <w:r>
-        <w:lastRenderedPageBreak/>
         <w:t xml:space="preserve">If it matches a line or space without the key signature except that the note is sharp then mark it with a sharp (for an ascending sequence) </w:t>
       </w:r>
     </w:p>
@@ -941,6 +961,7 @@
         </w:numPr>
       </w:pPr>
       <w:r>
+        <w:lastRenderedPageBreak/>
         <w:t>Bass Clef</w:t>
       </w:r>
     </w:p>
@@ -965,7 +986,6 @@
         </w:numPr>
       </w:pPr>
       <w:r>
-        <w:lastRenderedPageBreak/>
         <w:t>Animated notes are created on the right and move to the left but stop moving when the target note reaches the left</w:t>
       </w:r>
     </w:p>
@@ -2503,6 +2523,7 @@
         </w:numPr>
       </w:pPr>
       <w:r>
+        <w:lastRenderedPageBreak/>
         <w:t>&lt;ApplicationId&gt;com.yourname.yourapp&lt;/ApplicationId&gt;</w:t>
       </w:r>
     </w:p>
@@ -2542,7 +2563,6 @@
         <w:rPr>
           <w:rFonts w:ascii="Segoe UI Emoji" w:hAnsi="Segoe UI Emoji" w:cs="Segoe UI Emoji"/>
         </w:rPr>
-        <w:lastRenderedPageBreak/>
         <w:t>⚠️</w:t>
       </w:r>
       <w:r>
@@ -3213,6 +3233,7 @@
           <w:b/>
           <w:bCs/>
         </w:rPr>
+        <w:lastRenderedPageBreak/>
         <w:t>6️</w:t>
       </w:r>
       <w:r>
@@ -3275,7 +3296,6 @@
           <w:b/>
           <w:bCs/>
         </w:rPr>
-        <w:lastRenderedPageBreak/>
         <w:t>Full description</w:t>
       </w:r>
     </w:p>
@@ -3938,6 +3958,7 @@
         </w:numPr>
       </w:pPr>
       <w:r>
+        <w:lastRenderedPageBreak/>
         <w:t>Google AdMob</w:t>
       </w:r>
     </w:p>
@@ -3966,9 +3987,6 @@
       </w:r>
       <w:r>
         <w:br/>
-      </w:r>
-      <w:r>
-        <w:lastRenderedPageBreak/>
         <w:t>Cons:</w:t>
       </w:r>
       <w:r>
@@ -4618,6 +4636,7 @@
         </w:numPr>
       </w:pPr>
       <w:r>
+        <w:lastRenderedPageBreak/>
         <w:t>This will be on its own tab page called About MusicMate</w:t>
       </w:r>
     </w:p>
@@ -4662,7 +4681,6 @@
         </w:numPr>
       </w:pPr>
       <w:r>
-        <w:lastRenderedPageBreak/>
         <w:t>Remove the code in OnPurchaseButtonClicked that currently just toggles isPremiumUser</w:t>
       </w:r>
     </w:p>
@@ -5192,6 +5210,7 @@
         </w:numPr>
       </w:pPr>
       <w:r>
+        <w:lastRenderedPageBreak/>
         <w:t xml:space="preserve">adb.exe     is at </w:t>
       </w:r>
       <w:r>
@@ -5231,7 +5250,6 @@
         </w:numPr>
       </w:pPr>
       <w:r>
-        <w:lastRenderedPageBreak/>
         <w:t>adb devices</w:t>
       </w:r>
     </w:p>
@@ -5861,6 +5879,7 @@
         </w:numPr>
       </w:pPr>
       <w:r>
+        <w:lastRenderedPageBreak/>
         <w:t>logo.png</w:t>
       </w:r>
     </w:p>
@@ -5918,7 +5937,6 @@
           <w:sz w:val="28"/>
           <w:szCs w:val="28"/>
         </w:rPr>
-        <w:lastRenderedPageBreak/>
         <w:t>Step 1: Convert Your PNG to SVG</w:t>
       </w:r>
     </w:p>
@@ -6804,6 +6822,7 @@
         <w:ind w:left="1260"/>
       </w:pPr>
       <w:r>
+        <w:lastRenderedPageBreak/>
         <w:t xml:space="preserve">    x:Name="AppShellInstance"</w:t>
       </w:r>
     </w:p>
@@ -7022,6 +7041,7 @@
         <w:ind w:left="1260"/>
       </w:pPr>
       <w:r>
+        <w:lastRenderedPageBreak/>
         <w:t>&lt;/Shell&gt;</w:t>
       </w:r>
     </w:p>
@@ -7050,69 +7070,391 @@
         <w:ind w:left="1260"/>
       </w:pPr>
       <w:r>
+        <w:t xml:space="preserve">  &lt;MauiImage Remove="Resources\Images\icon_app.png" /&gt;</w:t>
+      </w:r>
+    </w:p>
+    <w:p>
+      <w:pPr>
+        <w:ind w:left="1260"/>
+      </w:pPr>
+      <w:r>
+        <w:t xml:space="preserve">  &lt;MauiImage Remove="Resources\Images\logo.png" /&gt;</w:t>
+      </w:r>
+    </w:p>
+    <w:p>
+      <w:pPr>
+        <w:ind w:left="1260"/>
+      </w:pPr>
+      <w:r>
+        <w:t>&lt;/ItemGroup&gt;</w:t>
+      </w:r>
+    </w:p>
+    <w:p>
+      <w:pPr>
+        <w:ind w:left="1260"/>
+      </w:pPr>
+    </w:p>
+    <w:p>
+      <w:pPr>
+        <w:ind w:left="1260"/>
+      </w:pPr>
+      <w:r>
+        <w:t>&lt;ItemGroup&gt;</w:t>
+      </w:r>
+    </w:p>
+    <w:p>
+      <w:pPr>
+        <w:ind w:left="1260"/>
+      </w:pPr>
+      <w:r>
+        <w:t xml:space="preserve">  &lt;None Remove="Resources\Images\home.png" /&gt;</w:t>
+      </w:r>
+    </w:p>
+    <w:p>
+      <w:pPr>
+        <w:ind w:left="1260"/>
+      </w:pPr>
+      <w:r>
+        <w:t xml:space="preserve">  &lt;None Remove="Resources\Images\icon_app.png" /&gt;</w:t>
+      </w:r>
+    </w:p>
+    <w:p>
+      <w:pPr>
+        <w:ind w:left="1260"/>
+      </w:pPr>
+      <w:r>
+        <w:t xml:space="preserve">  &lt;None Remove="Resources\Images\logo.png" /&gt;</w:t>
+      </w:r>
+    </w:p>
+    <w:p>
+      <w:pPr>
+        <w:ind w:left="1260"/>
+      </w:pPr>
+      <w:r>
+        <w:t>&lt;/ItemGroup&gt;</w:t>
+      </w:r>
+    </w:p>
+    <w:p>
+      <w:pPr>
+        <w:pStyle w:val="ListParagraph"/>
+        <w:numPr>
+          <w:ilvl w:val="1"/>
+          <w:numId w:val="1"/>
+        </w:numPr>
+      </w:pPr>
+      <w:r>
+        <w:t>Project Properies/Application/Android Targets/Target the Android Platform – check.</w:t>
+      </w:r>
+    </w:p>
+    <w:p>
+      <w:pPr>
+        <w:pStyle w:val="ListParagraph"/>
+        <w:numPr>
+          <w:ilvl w:val="1"/>
+          <w:numId w:val="1"/>
+        </w:numPr>
+      </w:pPr>
+      <w:r>
+        <w:t>Android</w:t>
+      </w:r>
+    </w:p>
+    <w:p>
+      <w:pPr>
+        <w:pStyle w:val="ListParagraph"/>
+        <w:numPr>
+          <w:ilvl w:val="2"/>
+          <w:numId w:val="1"/>
+        </w:numPr>
+      </w:pPr>
+      <w:r>
+        <w:t>2/6/2026 9:06 AM Used Tools&gt;Android&gt;Android Device Manager to add a second emulator in response to a warning</w:t>
+      </w:r>
+      <w:r>
+        <w:t>. This takes up several GB so if it does not improve performance. Delete it.</w:t>
+      </w:r>
+    </w:p>
+    <w:p>
+      <w:pPr>
+        <w:pStyle w:val="ListParagraph"/>
+        <w:numPr>
+          <w:ilvl w:val="2"/>
+          <w:numId w:val="1"/>
+        </w:numPr>
+        <w:rPr>
+          <w:b/>
+          <w:bCs/>
+        </w:rPr>
+      </w:pPr>
+      <w:r>
+        <w:rPr>
+          <w:b/>
+          <w:bCs/>
+        </w:rPr>
+        <w:t>Attempt 3 – Using png files only</w:t>
+      </w:r>
+    </w:p>
+    <w:p>
+      <w:pPr>
+        <w:pStyle w:val="ListParagraph"/>
+        <w:numPr>
+          <w:ilvl w:val="3"/>
+          <w:numId w:val="1"/>
+        </w:numPr>
+        <w:rPr>
+          <w:b/>
+          <w:bCs/>
+        </w:rPr>
+      </w:pPr>
+      <w:r>
+        <w:t>About, home, logo, settings, statistics sgvlogo?</w:t>
+      </w:r>
+    </w:p>
+    <w:p>
+      <w:pPr>
+        <w:pStyle w:val="ListParagraph"/>
+        <w:numPr>
+          <w:ilvl w:val="0"/>
+          <w:numId w:val="1"/>
+        </w:numPr>
+      </w:pPr>
+      <w:r>
+        <w:rPr>
+          <w:b/>
+          <w:bCs/>
+        </w:rPr>
+        <w:t>Pitfalls</w:t>
+      </w:r>
+    </w:p>
+    <w:p>
+      <w:pPr>
+        <w:pStyle w:val="ListParagraph"/>
+        <w:numPr>
+          <w:ilvl w:val="1"/>
+          <w:numId w:val="1"/>
+        </w:numPr>
+      </w:pPr>
+      <w:r>
+        <w:rPr>
+          <w:b/>
+          <w:bCs/>
+        </w:rPr>
+        <w:t>Deletion of Package Cache</w:t>
+      </w:r>
+    </w:p>
+    <w:p>
+      <w:pPr>
+        <w:pStyle w:val="ListParagraph"/>
+        <w:numPr>
+          <w:ilvl w:val="2"/>
+          <w:numId w:val="1"/>
+        </w:numPr>
+      </w:pPr>
+      <w:r>
+        <w:t>Why this keeps happening on your machine</w:t>
+      </w:r>
+    </w:p>
+    <w:p>
+      <w:pPr>
+        <w:pStyle w:val="ListParagraph"/>
+        <w:numPr>
+          <w:ilvl w:val="2"/>
+          <w:numId w:val="1"/>
+        </w:numPr>
+      </w:pPr>
+      <w:r>
+        <w:t>You’ve been doing:</w:t>
+      </w:r>
+    </w:p>
+    <w:p>
+      <w:pPr>
+        <w:pStyle w:val="ListParagraph"/>
+        <w:numPr>
+          <w:ilvl w:val="2"/>
+          <w:numId w:val="1"/>
+        </w:numPr>
+      </w:pPr>
+      <w:r>
+        <w:t>SDK upgrades</w:t>
+      </w:r>
+    </w:p>
+    <w:p>
+      <w:pPr>
+        <w:pStyle w:val="ListParagraph"/>
+        <w:numPr>
+          <w:ilvl w:val="2"/>
+          <w:numId w:val="1"/>
+        </w:numPr>
+      </w:pPr>
+      <w:r>
+        <w:t>Workload repairs</w:t>
+      </w:r>
+    </w:p>
+    <w:p>
+      <w:pPr>
+        <w:pStyle w:val="ListParagraph"/>
+        <w:numPr>
+          <w:ilvl w:val="2"/>
+          <w:numId w:val="1"/>
+        </w:numPr>
+      </w:pPr>
+      <w:r>
+        <w:t>Installer cleanups</w:t>
+      </w:r>
+    </w:p>
+    <w:p>
+      <w:pPr>
+        <w:pStyle w:val="ListParagraph"/>
+        <w:numPr>
+          <w:ilvl w:val="2"/>
+          <w:numId w:val="1"/>
+        </w:numPr>
+      </w:pPr>
+      <w:r>
+        <w:t>Possibly disk cleanup</w:t>
+      </w:r>
+    </w:p>
+    <w:p>
+      <w:pPr>
+        <w:pStyle w:val="ListParagraph"/>
+        <w:numPr>
+          <w:ilvl w:val="2"/>
+          <w:numId w:val="1"/>
+        </w:numPr>
+      </w:pPr>
+      <w:r>
+        <w:t>All of those can delete:</w:t>
+      </w:r>
+    </w:p>
+    <w:p>
+      <w:pPr>
+        <w:pStyle w:val="ListParagraph"/>
+        <w:numPr>
+          <w:ilvl w:val="2"/>
+          <w:numId w:val="1"/>
+        </w:numPr>
+      </w:pPr>
+      <w:r>
+        <w:t>C:\ProgramData\Package Cache\</w:t>
+      </w:r>
+    </w:p>
+    <w:p>
+      <w:pPr>
+        <w:pStyle w:val="ListParagraph"/>
+        <w:numPr>
+          <w:ilvl w:val="2"/>
+          <w:numId w:val="1"/>
+        </w:numPr>
+      </w:pPr>
+      <w:r>
+        <w:t>When that cache goes missing:</w:t>
+      </w:r>
+    </w:p>
+    <w:p>
+      <w:pPr>
+        <w:pStyle w:val="ListParagraph"/>
+        <w:numPr>
+          <w:ilvl w:val="2"/>
+          <w:numId w:val="1"/>
+        </w:numPr>
+      </w:pPr>
+      <w:r>
+        <w:t xml:space="preserve">Windows </w:t>
+      </w:r>
+      <w:r>
+        <w:rPr>
+          <w:b/>
+          <w:bCs/>
+        </w:rPr>
+        <w:t>cannot repair or uninstall MSI-installed apps</w:t>
+      </w:r>
+    </w:p>
+    <w:p>
+      <w:pPr>
+        <w:pStyle w:val="ListParagraph"/>
+        <w:numPr>
+          <w:ilvl w:val="2"/>
+          <w:numId w:val="1"/>
+        </w:numPr>
+      </w:pPr>
+      <w:r>
+        <w:t>You get the exact error you saw</w:t>
+      </w:r>
+    </w:p>
+    <w:p>
+      <w:pPr>
+        <w:pStyle w:val="ListParagraph"/>
+        <w:numPr>
+          <w:ilvl w:val="2"/>
+          <w:numId w:val="1"/>
+        </w:numPr>
+      </w:pPr>
+      <w:r>
+        <w:t>This is the same underlying problem you hit with MAUI workloads.</w:t>
+      </w:r>
+    </w:p>
+    <w:p>
+      <w:pPr>
+        <w:pStyle w:val="ListParagraph"/>
+        <w:numPr>
+          <w:ilvl w:val="2"/>
+          <w:numId w:val="1"/>
+        </w:numPr>
+      </w:pPr>
+      <w:r>
+        <w:t>Solution was to re-install PowerShell from the Micrsoft web page.</w:t>
+      </w:r>
+    </w:p>
+    <w:p>
+      <w:pPr>
+        <w:pStyle w:val="ListParagraph"/>
+        <w:numPr>
+          <w:ilvl w:val="0"/>
+          <w:numId w:val="1"/>
+        </w:numPr>
+        <w:rPr>
+          <w:b/>
+          <w:bCs/>
+        </w:rPr>
+      </w:pPr>
+      <w:r>
+        <w:rPr>
+          <w:b/>
+          <w:bCs/>
+        </w:rPr>
+        <w:t xml:space="preserve">Performance </w:t>
+      </w:r>
+    </w:p>
+    <w:p>
+      <w:pPr>
+        <w:pStyle w:val="ListParagraph"/>
+        <w:numPr>
+          <w:ilvl w:val="1"/>
+          <w:numId w:val="1"/>
+        </w:numPr>
+      </w:pPr>
+      <w:r>
         <w:lastRenderedPageBreak/>
-        <w:t xml:space="preserve">  &lt;MauiImage Remove="Resources\Images\icon_app.png" /&gt;</w:t>
-      </w:r>
-    </w:p>
-    <w:p>
-      <w:pPr>
-        <w:ind w:left="1260"/>
-      </w:pPr>
-      <w:r>
-        <w:t xml:space="preserve">  &lt;MauiImage Remove="Resources\Images\logo.png" /&gt;</w:t>
-      </w:r>
-    </w:p>
-    <w:p>
-      <w:pPr>
-        <w:ind w:left="1260"/>
-      </w:pPr>
-      <w:r>
-        <w:t>&lt;/ItemGroup&gt;</w:t>
-      </w:r>
-    </w:p>
-    <w:p>
-      <w:pPr>
-        <w:ind w:left="1260"/>
-      </w:pPr>
-    </w:p>
-    <w:p>
-      <w:pPr>
-        <w:ind w:left="1260"/>
-      </w:pPr>
-      <w:r>
-        <w:t>&lt;ItemGroup&gt;</w:t>
-      </w:r>
-    </w:p>
-    <w:p>
-      <w:pPr>
-        <w:ind w:left="1260"/>
-      </w:pPr>
-      <w:r>
-        <w:t xml:space="preserve">  &lt;None Remove="Resources\Images\home.png" /&gt;</w:t>
-      </w:r>
-    </w:p>
-    <w:p>
-      <w:pPr>
-        <w:ind w:left="1260"/>
-      </w:pPr>
-      <w:r>
-        <w:t xml:space="preserve">  &lt;None Remove="Resources\Images\icon_app.png" /&gt;</w:t>
-      </w:r>
-    </w:p>
-    <w:p>
-      <w:pPr>
-        <w:ind w:left="1260"/>
-      </w:pPr>
-      <w:r>
-        <w:t xml:space="preserve">  &lt;None Remove="Resources\Images\logo.png" /&gt;</w:t>
-      </w:r>
-    </w:p>
-    <w:p>
-      <w:pPr>
-        <w:ind w:left="1260"/>
-      </w:pPr>
-      <w:r>
-        <w:t>&lt;/ItemGroup&gt;</w:t>
+        <w:t>ChatGPT says display of note in status will not reduce the maxjimum tempo that can be detected.</w:t>
+      </w:r>
+    </w:p>
+    <w:p>
+      <w:pPr>
+        <w:pStyle w:val="ListParagraph"/>
+        <w:numPr>
+          <w:ilvl w:val="0"/>
+          <w:numId w:val="1"/>
+        </w:numPr>
+        <w:rPr>
+          <w:b/>
+          <w:bCs/>
+        </w:rPr>
+      </w:pPr>
+      <w:r>
+        <w:rPr>
+          <w:b/>
+          <w:bCs/>
+        </w:rPr>
+        <w:t>Competition</w:t>
       </w:r>
     </w:p>
     <w:p>
@@ -7124,70 +7466,10 @@
         </w:numPr>
       </w:pPr>
       <w:r>
-        <w:t>Project Properies/Application/Android Targets/Target the Android Platform – check.</w:t>
-      </w:r>
-    </w:p>
-    <w:p>
-      <w:pPr>
-        <w:pStyle w:val="ListParagraph"/>
-        <w:numPr>
-          <w:ilvl w:val="1"/>
-          <w:numId w:val="1"/>
-        </w:numPr>
-      </w:pPr>
-      <w:r>
-        <w:t>Android</w:t>
-      </w:r>
-    </w:p>
-    <w:p>
-      <w:pPr>
-        <w:pStyle w:val="ListParagraph"/>
-        <w:numPr>
-          <w:ilvl w:val="2"/>
-          <w:numId w:val="1"/>
-        </w:numPr>
-      </w:pPr>
-      <w:r>
-        <w:t>2/6/2026 9:06 AM Used Tools&gt;Android&gt;Android Device Manager to add a second emulator in response to a warning</w:t>
-      </w:r>
-      <w:r>
-        <w:t>. This takes up several GB so if it does not improve performance. Delete it.</w:t>
-      </w:r>
-    </w:p>
-    <w:p>
-      <w:pPr>
-        <w:pStyle w:val="ListParagraph"/>
-        <w:numPr>
-          <w:ilvl w:val="2"/>
-          <w:numId w:val="1"/>
-        </w:numPr>
-        <w:rPr>
-          <w:b/>
-          <w:bCs/>
-        </w:rPr>
-      </w:pPr>
-      <w:r>
-        <w:rPr>
-          <w:b/>
-          <w:bCs/>
-        </w:rPr>
-        <w:t>Attempt 3 – Using png files only</w:t>
-      </w:r>
-    </w:p>
-    <w:p>
-      <w:pPr>
-        <w:pStyle w:val="ListParagraph"/>
-        <w:numPr>
-          <w:ilvl w:val="3"/>
-          <w:numId w:val="1"/>
-        </w:numPr>
-        <w:rPr>
-          <w:b/>
-          <w:bCs/>
-        </w:rPr>
-      </w:pPr>
-      <w:r>
-        <w:t>About, home, logo, settings, statistics sgvlogo?</w:t>
+        <w:t>See spreadsheet</w:t>
+      </w:r>
+      <w:r>
+        <w:t xml:space="preserve"> </w:t>
       </w:r>
     </w:p>
     <w:p>
@@ -7199,270 +7481,8 @@
         </w:numPr>
       </w:pPr>
       <w:r>
-        <w:rPr>
-          <w:b/>
-          <w:bCs/>
-        </w:rPr>
-        <w:t>Pitfalls</w:t>
-      </w:r>
-    </w:p>
-    <w:p>
-      <w:pPr>
-        <w:pStyle w:val="ListParagraph"/>
-        <w:numPr>
-          <w:ilvl w:val="1"/>
-          <w:numId w:val="1"/>
-        </w:numPr>
-      </w:pPr>
-      <w:r>
-        <w:rPr>
-          <w:b/>
-          <w:bCs/>
-        </w:rPr>
-        <w:t>Deletion of Package Cache</w:t>
-      </w:r>
-    </w:p>
-    <w:p>
-      <w:pPr>
-        <w:pStyle w:val="ListParagraph"/>
-        <w:numPr>
-          <w:ilvl w:val="2"/>
-          <w:numId w:val="1"/>
-        </w:numPr>
-      </w:pPr>
-      <w:r>
-        <w:t>Why this keeps happening on your machine</w:t>
-      </w:r>
-    </w:p>
-    <w:p>
-      <w:pPr>
-        <w:pStyle w:val="ListParagraph"/>
-        <w:numPr>
-          <w:ilvl w:val="2"/>
-          <w:numId w:val="1"/>
-        </w:numPr>
-      </w:pPr>
-      <w:r>
-        <w:t>You’ve been doing:</w:t>
-      </w:r>
-    </w:p>
-    <w:p>
-      <w:pPr>
-        <w:pStyle w:val="ListParagraph"/>
-        <w:numPr>
-          <w:ilvl w:val="2"/>
-          <w:numId w:val="1"/>
-        </w:numPr>
-      </w:pPr>
-      <w:r>
-        <w:t>SDK upgrades</w:t>
-      </w:r>
-    </w:p>
-    <w:p>
-      <w:pPr>
-        <w:pStyle w:val="ListParagraph"/>
-        <w:numPr>
-          <w:ilvl w:val="2"/>
-          <w:numId w:val="1"/>
-        </w:numPr>
-      </w:pPr>
-      <w:r>
-        <w:t>Workload repairs</w:t>
-      </w:r>
-    </w:p>
-    <w:p>
-      <w:pPr>
-        <w:pStyle w:val="ListParagraph"/>
-        <w:numPr>
-          <w:ilvl w:val="2"/>
-          <w:numId w:val="1"/>
-        </w:numPr>
-      </w:pPr>
-      <w:r>
-        <w:t>Installer cleanups</w:t>
-      </w:r>
-    </w:p>
-    <w:p>
-      <w:pPr>
-        <w:pStyle w:val="ListParagraph"/>
-        <w:numPr>
-          <w:ilvl w:val="2"/>
-          <w:numId w:val="1"/>
-        </w:numPr>
-      </w:pPr>
-      <w:r>
-        <w:t>Possibly disk cleanup</w:t>
-      </w:r>
-    </w:p>
-    <w:p>
-      <w:pPr>
-        <w:pStyle w:val="ListParagraph"/>
-        <w:numPr>
-          <w:ilvl w:val="2"/>
-          <w:numId w:val="1"/>
-        </w:numPr>
-      </w:pPr>
-      <w:r>
-        <w:t>All of those can delete:</w:t>
-      </w:r>
-    </w:p>
-    <w:p>
-      <w:pPr>
-        <w:pStyle w:val="ListParagraph"/>
-        <w:numPr>
-          <w:ilvl w:val="2"/>
-          <w:numId w:val="1"/>
-        </w:numPr>
-      </w:pPr>
-      <w:r>
-        <w:t>C:\ProgramData\Package Cache\</w:t>
-      </w:r>
-    </w:p>
-    <w:p>
-      <w:pPr>
-        <w:pStyle w:val="ListParagraph"/>
-        <w:numPr>
-          <w:ilvl w:val="2"/>
-          <w:numId w:val="1"/>
-        </w:numPr>
-      </w:pPr>
-      <w:r>
-        <w:t>When that cache goes missing:</w:t>
-      </w:r>
-    </w:p>
-    <w:p>
-      <w:pPr>
-        <w:pStyle w:val="ListParagraph"/>
-        <w:numPr>
-          <w:ilvl w:val="2"/>
-          <w:numId w:val="1"/>
-        </w:numPr>
-      </w:pPr>
-      <w:r>
-        <w:t xml:space="preserve">Windows </w:t>
-      </w:r>
-      <w:r>
-        <w:rPr>
-          <w:b/>
-          <w:bCs/>
-        </w:rPr>
-        <w:t>cannot repair or uninstall MSI-installed apps</w:t>
-      </w:r>
-    </w:p>
-    <w:p>
-      <w:pPr>
-        <w:pStyle w:val="ListParagraph"/>
-        <w:numPr>
-          <w:ilvl w:val="2"/>
-          <w:numId w:val="1"/>
-        </w:numPr>
-      </w:pPr>
-      <w:r>
-        <w:t>You get the exact error you saw</w:t>
-      </w:r>
-    </w:p>
-    <w:p>
-      <w:pPr>
-        <w:pStyle w:val="ListParagraph"/>
-        <w:numPr>
-          <w:ilvl w:val="2"/>
-          <w:numId w:val="1"/>
-        </w:numPr>
-      </w:pPr>
-      <w:r>
-        <w:t>This is the same underlying problem you hit with MAUI workloads.</w:t>
-      </w:r>
-    </w:p>
-    <w:p>
-      <w:pPr>
-        <w:pStyle w:val="ListParagraph"/>
-        <w:numPr>
-          <w:ilvl w:val="2"/>
-          <w:numId w:val="1"/>
-        </w:numPr>
-      </w:pPr>
-      <w:r>
-        <w:t>Solution was to re-install PowerShell from the Micrsoft web page.</w:t>
-      </w:r>
-    </w:p>
-    <w:p>
-      <w:pPr>
-        <w:pStyle w:val="ListParagraph"/>
-        <w:numPr>
-          <w:ilvl w:val="0"/>
-          <w:numId w:val="1"/>
-        </w:numPr>
-        <w:rPr>
-          <w:b/>
-          <w:bCs/>
-        </w:rPr>
-      </w:pPr>
-      <w:r>
-        <w:rPr>
-          <w:b/>
-          <w:bCs/>
-        </w:rPr>
-        <w:t xml:space="preserve">Performance </w:t>
-      </w:r>
-    </w:p>
-    <w:p>
-      <w:pPr>
-        <w:pStyle w:val="ListParagraph"/>
-        <w:numPr>
-          <w:ilvl w:val="1"/>
-          <w:numId w:val="1"/>
-        </w:numPr>
-      </w:pPr>
-      <w:r>
-        <w:t>ChatGPT says display of note in status will not reduce the maxjimum tempo that can be detected.</w:t>
-      </w:r>
-    </w:p>
-    <w:p>
-      <w:pPr>
-        <w:pStyle w:val="ListParagraph"/>
-        <w:numPr>
-          <w:ilvl w:val="0"/>
-          <w:numId w:val="1"/>
-        </w:numPr>
-        <w:rPr>
-          <w:b/>
-          <w:bCs/>
-        </w:rPr>
-      </w:pPr>
-      <w:r>
-        <w:rPr>
-          <w:b/>
-          <w:bCs/>
-        </w:rPr>
-        <w:t>Competition</w:t>
-      </w:r>
-    </w:p>
-    <w:p>
-      <w:pPr>
-        <w:pStyle w:val="ListParagraph"/>
-        <w:numPr>
-          <w:ilvl w:val="1"/>
-          <w:numId w:val="1"/>
-        </w:numPr>
-      </w:pPr>
-      <w:r>
-        <w:t>See spreadsheet</w:t>
-      </w:r>
-      <w:r>
         <w:t xml:space="preserve"> </w:t>
       </w:r>
-    </w:p>
-    <w:p>
-      <w:pPr>
-        <w:pStyle w:val="ListParagraph"/>
-        <w:numPr>
-          <w:ilvl w:val="0"/>
-          <w:numId w:val="1"/>
-        </w:numPr>
-      </w:pPr>
-      <w:r>
-        <w:t xml:space="preserve"> </w:t>
-      </w:r>
       <w:r>
         <w:rPr>
           <w:b/>
@@ -7474,11 +7494,7 @@
         <w:br/>
       </w:r>
       <w:r>
-        <w:t xml:space="preserve">I have a store listing for Music Mate in Google Play. I have tested the program in debug </w:t>
-      </w:r>
-      <w:r>
-        <w:lastRenderedPageBreak/>
-        <w:t>mode with a Buy Premium button that just toggles premium privilege. Can you give me a check list of the next steps to publishing.</w:t>
+        <w:t>I have a store listing for Music Mate in Google Play. I have tested the program in debug mode with a Buy Premium button that just toggles premium privilege. Can you give me a check list of the next steps to publishing.</w:t>
       </w:r>
     </w:p>
     <w:p>
@@ -7792,6 +7808,7 @@
         <w:ind w:left="180"/>
       </w:pPr>
       <w:r>
+        <w:lastRenderedPageBreak/>
         <w:pict w14:anchorId="3D3BC1E0">
           <v:rect id="_x0000_i1042" style="width:0;height:1.5pt" o:hralign="center" o:hrstd="t" o:hr="t" fillcolor="#a0a0a0" stroked="f"/>
         </w:pict>
@@ -7834,7 +7851,6 @@
         <w:ind w:left="180"/>
       </w:pPr>
       <w:r>
-        <w:lastRenderedPageBreak/>
         <w:t>Go to:</w:t>
       </w:r>
       <w:r>
@@ -8128,6 +8144,7 @@
         <w:ind w:left="180"/>
       </w:pPr>
       <w:r>
+        <w:lastRenderedPageBreak/>
         <w:pict w14:anchorId="51F0EDAB">
           <v:rect id="_x0000_i1045" style="width:0;height:1.5pt" o:hralign="center" o:hrstd="t" o:hr="t" fillcolor="#a0a0a0" stroked="f"/>
         </w:pict>
@@ -8178,7 +8195,6 @@
           <w:b/>
           <w:bCs/>
         </w:rPr>
-        <w:lastRenderedPageBreak/>
         <w:t>Required:</w:t>
       </w:r>
     </w:p>
@@ -8453,6 +8469,7 @@
         <w:ind w:left="180"/>
       </w:pPr>
       <w:r>
+        <w:lastRenderedPageBreak/>
         <w:t xml:space="preserve">App: </w:t>
       </w:r>
       <w:r>
@@ -8487,7 +8504,6 @@
         <w:ind w:left="180"/>
       </w:pPr>
       <w:r>
-        <w:lastRenderedPageBreak/>
         <w:pict w14:anchorId="057B8E07">
           <v:rect id="_x0000_i1048" style="width:0;height:1.5pt" o:hralign="center" o:hrstd="t" o:hr="t" fillcolor="#a0a0a0" stroked="f"/>
         </w:pict>
@@ -8801,6 +8817,7 @@
         <w:rPr>
           <w:rFonts w:ascii="Segoe UI Emoji" w:hAnsi="Segoe UI Emoji" w:cs="Segoe UI Emoji"/>
         </w:rPr>
+        <w:lastRenderedPageBreak/>
         <w:t>❌</w:t>
       </w:r>
       <w:r>
@@ -8843,7 +8860,6 @@
         <w:rPr>
           <w:rFonts w:ascii="Segoe UI Emoji" w:hAnsi="Segoe UI Emoji" w:cs="Segoe UI Emoji"/>
         </w:rPr>
-        <w:lastRenderedPageBreak/>
         <w:t>❌</w:t>
       </w:r>
       <w:r>
@@ -9170,6 +9186,7 @@
         </w:numPr>
       </w:pPr>
       <w:r>
+        <w:lastRenderedPageBreak/>
         <w:t xml:space="preserve">fonts </w:t>
       </w:r>
     </w:p>
@@ -9230,7 +9247,6 @@
         </w:numPr>
       </w:pPr>
       <w:r>
-        <w:lastRenderedPageBreak/>
         <w:t xml:space="preserve">Open </w:t>
       </w:r>
       <w:r>
@@ -9696,6 +9712,7 @@
         </w:rPr>
       </w:pPr>
       <w:r>
+        <w:lastRenderedPageBreak/>
         <w:t xml:space="preserve"> </w:t>
       </w:r>
       <w:r>
@@ -9727,7 +9744,6 @@
         <w:ind w:left="630"/>
       </w:pPr>
       <w:r>
-        <w:lastRenderedPageBreak/>
         <w:t xml:space="preserve">If yes, would you be willing to help test my new Android app, </w:t>
       </w:r>
       <w:r>
@@ -10026,6 +10042,7 @@
           <w:b/>
           <w:bCs/>
         </w:rPr>
+        <w:lastRenderedPageBreak/>
         <w:t>What Android version is it running, if they know?</w:t>
       </w:r>
       <w:r>
@@ -10058,7 +10075,6 @@
           <w:b/>
           <w:bCs/>
         </w:rPr>
-        <w:lastRenderedPageBreak/>
         <w:t>Are they comfortable installing from a Google Play test link?</w:t>
       </w:r>
       <w:r>
@@ -10338,6 +10354,7 @@
         <w:ind w:left="270"/>
       </w:pPr>
       <w:r>
+        <w:lastRenderedPageBreak/>
         <w:t>5. Enharmonic Boundary Notes</w:t>
       </w:r>
     </w:p>
@@ -10433,7 +10450,6 @@
         <w:ind w:left="270"/>
       </w:pPr>
       <w:r>
-        <w:lastRenderedPageBreak/>
         <w:t>Fallback Behavior</w:t>
       </w:r>
     </w:p>
@@ -10698,6 +10714,7 @@
         <w:ind w:left="270"/>
       </w:pPr>
       <w:r>
+        <w:lastRenderedPageBreak/>
         <w:t xml:space="preserve">The key point is that they must open the link while signed into the </w:t>
       </w:r>
       <w:r>

</xml_diff>

<commit_message>
Before update of Billing 8 migration
</commit_message>
<xml_diff>
--- a/Docs/Design.docx
+++ b/Docs/Design.docx
@@ -16,6 +16,9 @@
         </w:numPr>
       </w:pPr>
       <w:r>
+        <w:rPr>
+          <w:rStyle w:val="Strong"/>
+        </w:rPr>
         <w:t>Factory Defaults</w:t>
       </w:r>
       <w:r>
@@ -566,7 +569,6 @@
         </w:numPr>
       </w:pPr>
       <w:r>
-        <w:lastRenderedPageBreak/>
         <w:t xml:space="preserve">If </w:t>
       </w:r>
       <w:r>
@@ -961,7 +963,6 @@
         </w:numPr>
       </w:pPr>
       <w:r>
-        <w:lastRenderedPageBreak/>
         <w:t>Bass Clef</w:t>
       </w:r>
     </w:p>
@@ -2523,7 +2524,6 @@
         </w:numPr>
       </w:pPr>
       <w:r>
-        <w:lastRenderedPageBreak/>
         <w:t>&lt;ApplicationId&gt;com.yourname.yourapp&lt;/ApplicationId&gt;</w:t>
       </w:r>
     </w:p>
@@ -3233,7 +3233,6 @@
           <w:b/>
           <w:bCs/>
         </w:rPr>
-        <w:lastRenderedPageBreak/>
         <w:t>6️</w:t>
       </w:r>
       <w:r>
@@ -3958,7 +3957,6 @@
         </w:numPr>
       </w:pPr>
       <w:r>
-        <w:lastRenderedPageBreak/>
         <w:t>Google AdMob</w:t>
       </w:r>
     </w:p>
@@ -4636,7 +4634,6 @@
         </w:numPr>
       </w:pPr>
       <w:r>
-        <w:lastRenderedPageBreak/>
         <w:t>This will be on its own tab page called About MusicMate</w:t>
       </w:r>
     </w:p>
@@ -5210,7 +5207,6 @@
         </w:numPr>
       </w:pPr>
       <w:r>
-        <w:lastRenderedPageBreak/>
         <w:t xml:space="preserve">adb.exe     is at </w:t>
       </w:r>
       <w:r>
@@ -5879,7 +5875,6 @@
         </w:numPr>
       </w:pPr>
       <w:r>
-        <w:lastRenderedPageBreak/>
         <w:t>logo.png</w:t>
       </w:r>
     </w:p>
@@ -6822,7 +6817,6 @@
         <w:ind w:left="1260"/>
       </w:pPr>
       <w:r>
-        <w:lastRenderedPageBreak/>
         <w:t xml:space="preserve">    x:Name="AppShellInstance"</w:t>
       </w:r>
     </w:p>
@@ -7041,7 +7035,6 @@
         <w:ind w:left="1260"/>
       </w:pPr>
       <w:r>
-        <w:lastRenderedPageBreak/>
         <w:t>&lt;/Shell&gt;</w:t>
       </w:r>
     </w:p>
@@ -7433,7 +7426,6 @@
         </w:numPr>
       </w:pPr>
       <w:r>
-        <w:lastRenderedPageBreak/>
         <w:t>ChatGPT says display of note in status will not reduce the maxjimum tempo that can be detected.</w:t>
       </w:r>
     </w:p>
@@ -7808,7 +7800,6 @@
         <w:ind w:left="180"/>
       </w:pPr>
       <w:r>
-        <w:lastRenderedPageBreak/>
         <w:pict w14:anchorId="3D3BC1E0">
           <v:rect id="_x0000_i1042" style="width:0;height:1.5pt" o:hralign="center" o:hrstd="t" o:hr="t" fillcolor="#a0a0a0" stroked="f"/>
         </w:pict>
@@ -8144,7 +8135,6 @@
         <w:ind w:left="180"/>
       </w:pPr>
       <w:r>
-        <w:lastRenderedPageBreak/>
         <w:pict w14:anchorId="51F0EDAB">
           <v:rect id="_x0000_i1045" style="width:0;height:1.5pt" o:hralign="center" o:hrstd="t" o:hr="t" fillcolor="#a0a0a0" stroked="f"/>
         </w:pict>
@@ -8469,7 +8459,6 @@
         <w:ind w:left="180"/>
       </w:pPr>
       <w:r>
-        <w:lastRenderedPageBreak/>
         <w:t xml:space="preserve">App: </w:t>
       </w:r>
       <w:r>
@@ -8817,7 +8806,6 @@
         <w:rPr>
           <w:rFonts w:ascii="Segoe UI Emoji" w:hAnsi="Segoe UI Emoji" w:cs="Segoe UI Emoji"/>
         </w:rPr>
-        <w:lastRenderedPageBreak/>
         <w:t>❌</w:t>
       </w:r>
       <w:r>
@@ -9186,7 +9174,6 @@
         </w:numPr>
       </w:pPr>
       <w:r>
-        <w:lastRenderedPageBreak/>
         <w:t xml:space="preserve">fonts </w:t>
       </w:r>
     </w:p>
@@ -9712,7 +9699,6 @@
         </w:rPr>
       </w:pPr>
       <w:r>
-        <w:lastRenderedPageBreak/>
         <w:t xml:space="preserve"> </w:t>
       </w:r>
       <w:r>
@@ -10042,7 +10028,6 @@
           <w:b/>
           <w:bCs/>
         </w:rPr>
-        <w:lastRenderedPageBreak/>
         <w:t>What Android version is it running, if they know?</w:t>
       </w:r>
       <w:r>
@@ -10354,7 +10339,6 @@
         <w:ind w:left="270"/>
       </w:pPr>
       <w:r>
-        <w:lastRenderedPageBreak/>
         <w:t>5. Enharmonic Boundary Notes</w:t>
       </w:r>
     </w:p>
@@ -10714,7 +10698,6 @@
         <w:ind w:left="270"/>
       </w:pPr>
       <w:r>
-        <w:lastRenderedPageBreak/>
         <w:t xml:space="preserve">The key point is that they must open the link while signed into the </w:t>
       </w:r>
       <w:r>

</xml_diff>

<commit_message>
Tuning fork, constant selectable note added to Tuner.
</commit_message>
<xml_diff>
--- a/Docs/Design.docx
+++ b/Docs/Design.docx
@@ -100,18 +100,6 @@
           <w:bCs/>
         </w:rPr>
         <w:t>Drawing notes for various scales</w:t>
-      </w:r>
-    </w:p>
-    <w:p>
-      <w:pPr>
-        <w:pStyle w:val="ListParagraph"/>
-        <w:numPr>
-          <w:ilvl w:val="1"/>
-          <w:numId w:val="1"/>
-        </w:numPr>
-      </w:pPr>
-      <w:r>
-        <w:t>App MusicMateMaui ran on the pixel 10 (1/12/23) but after many tries AI failed to get the correct notes.</w:t>
       </w:r>
     </w:p>
     <w:p>
@@ -2039,7 +2027,13 @@
         </w:numPr>
       </w:pPr>
       <w:r>
-        <w:t>Screen touch to Google Play Store desining tips and pricing for free and Pro upgrade</w:t>
+        <w:t>Screen touch to Google Play Store desi</w:t>
+      </w:r>
+      <w:r>
+        <w:t>g</w:t>
+      </w:r>
+      <w:r>
+        <w:t>ning tips and pricing for free and Pro upgrade</w:t>
       </w:r>
       <w:r>
         <w:br/>
@@ -2130,6 +2124,18 @@
       </w:pPr>
       <w:r>
         <w:t>One version is $5 one time payment</w:t>
+      </w:r>
+    </w:p>
+    <w:p>
+      <w:pPr>
+        <w:pStyle w:val="ListParagraph"/>
+        <w:numPr>
+          <w:ilvl w:val="1"/>
+          <w:numId w:val="1"/>
+        </w:numPr>
+      </w:pPr>
+      <w:r>
+        <w:t>There are many more: search Music on the Play Store.</w:t>
       </w:r>
     </w:p>
     <w:p>
@@ -10725,7 +10731,7 @@
           <w:rFonts w:cstheme="minorHAnsi"/>
         </w:rPr>
         <w:pict w14:anchorId="57A33D20">
-          <v:rect id="_x0000_i1055" style="width:0;height:1.5pt" o:hralign="center" o:hrstd="t" o:hr="t" fillcolor="#a0a0a0" stroked="f"/>
+          <v:rect id="_x0000_i1054" style="width:0;height:1.5pt" o:hralign="center" o:hrstd="t" o:hr="t" fillcolor="#a0a0a0" stroked="f"/>
         </w:pict>
       </w:r>
     </w:p>
@@ -11549,19 +11555,7 @@
         <w:rPr>
           <w:rFonts w:cstheme="minorHAnsi"/>
         </w:rPr>
-        <w:t>Deb Robers wrote “</w:t>
-      </w:r>
-      <w:r>
-        <w:rPr>
-          <w:rFonts w:cstheme="minorHAnsi"/>
-        </w:rPr>
-        <w:t>Can you add interval training for aural skills to the app? </w:t>
-      </w:r>
-      <w:r>
-        <w:rPr>
-          <w:rFonts w:cstheme="minorHAnsi"/>
-        </w:rPr>
-        <w:t>“</w:t>
+        <w:t>Deb Robers wrote “Can you add interval training for aural skills to the app? “</w:t>
       </w:r>
     </w:p>
     <w:p>
@@ -23599,6 +23593,7 @@
   <w:style w:type="character" w:default="1" w:styleId="DefaultParagraphFont">
     <w:name w:val="Default Paragraph Font"/>
     <w:uiPriority w:val="1"/>
+    <w:semiHidden/>
     <w:unhideWhenUsed/>
   </w:style>
   <w:style w:type="table" w:default="1" w:styleId="TableNormal">

</xml_diff>